<commit_message>
Integrate polished UI kit and menu flow
</commit_message>
<xml_diff>
--- a/Informe_Shadow_Beat_Fragmentos_de_Luz.docx
+++ b/Informe_Shadow_Beat_Fragmentos_de_Luz.docx
@@ -2129,15 +2129,7 @@
         <w:rPr>
           <w:b w:val="0"/>
         </w:rPr>
-        <w:t>click del mouse.</w:t>
-      </w:r>
-    </w:p>
-    <w:p>
-      <w:r>
-        <w:rPr>
-          <w:b w:val="0"/>
-        </w:rPr>
-        <w:t>Se agrego un pequeño margen de tolerancia mediante:</w:t>
+        <w:t>flecha arriba,</w:t>
       </w:r>
     </w:p>
     <w:p>
@@ -2148,6 +2140,27 @@
       </w:pPr>
       <w:r>
         <w:rPr>
+          <w:b w:val="0"/>
+        </w:rPr>
+        <w:t>click del mouse.</w:t>
+      </w:r>
+    </w:p>
+    <w:p>
+      <w:r>
+        <w:rPr>
+          <w:b w:val="0"/>
+        </w:rPr>
+        <w:t>Se agrego un pequeño margen de tolerancia mediante:</w:t>
+      </w:r>
+    </w:p>
+    <w:p>
+      <w:pPr>
+        <w:pStyle w:val="ListBullet"/>
+        <w:spacing w:after="160" w:line="280" w:lineRule="auto"/>
+        <w:ind w:left="720" w:hanging="360"/>
+      </w:pPr>
+      <w:r>
+        <w:rPr>
           <w:rFonts w:ascii="Consolas" w:hAnsi="Consolas"/>
           <w:color w:val="1F4D78"/>
           <w:sz w:val="20"/>
@@ -3255,15 +3268,7 @@
         <w:rPr>
           <w:b w:val="0"/>
         </w:rPr>
-        <w:t>boton para volver al menú.</w:t>
-      </w:r>
-    </w:p>
-    <w:p>
-      <w:r>
-        <w:rPr>
-          <w:b w:val="0"/>
-        </w:rPr>
-        <w:t>Script:</w:t>
+        <w:t>boton para volver al menú,</w:t>
       </w:r>
     </w:p>
     <w:p>
@@ -3274,6 +3279,40 @@
       </w:pPr>
       <w:r>
         <w:rPr>
+          <w:b w:val="0"/>
+        </w:rPr>
+        <w:t>ayuda de controles,</w:t>
+      </w:r>
+    </w:p>
+    <w:p>
+      <w:pPr>
+        <w:pStyle w:val="ListBullet"/>
+        <w:spacing w:after="160" w:line="280" w:lineRule="auto"/>
+        <w:ind w:left="720" w:hanging="360"/>
+      </w:pPr>
+      <w:r>
+        <w:rPr>
+          <w:b w:val="0"/>
+        </w:rPr>
+        <w:t>panel de pausa.</w:t>
+      </w:r>
+    </w:p>
+    <w:p>
+      <w:r>
+        <w:rPr>
+          <w:b w:val="0"/>
+        </w:rPr>
+        <w:t>Script:</w:t>
+      </w:r>
+    </w:p>
+    <w:p>
+      <w:pPr>
+        <w:pStyle w:val="ListBullet"/>
+        <w:spacing w:after="160" w:line="280" w:lineRule="auto"/>
+        <w:ind w:left="720" w:hanging="360"/>
+      </w:pPr>
+      <w:r>
+        <w:rPr>
           <w:rFonts w:ascii="Consolas" w:hAnsi="Consolas"/>
           <w:color w:val="1F4D78"/>
           <w:sz w:val="20"/>
@@ -4224,7 +4263,59 @@
         <w:rPr>
           <w:b w:val="0"/>
         </w:rPr>
-        <w:t>morir y reintentar.</w:t>
+        <w:t>morir y reintentar,</w:t>
+      </w:r>
+    </w:p>
+    <w:p>
+      <w:pPr>
+        <w:pStyle w:val="ListBullet"/>
+        <w:spacing w:after="160" w:line="280" w:lineRule="auto"/>
+        <w:ind w:left="720" w:hanging="360"/>
+      </w:pPr>
+      <w:r>
+        <w:rPr>
+          <w:b w:val="0"/>
+        </w:rPr>
+        <w:t>pausar y continuar el nivel,</w:t>
+      </w:r>
+    </w:p>
+    <w:p>
+      <w:pPr>
+        <w:pStyle w:val="ListBullet"/>
+        <w:spacing w:after="160" w:line="280" w:lineRule="auto"/>
+        <w:ind w:left="720" w:hanging="360"/>
+      </w:pPr>
+      <w:r>
+        <w:rPr>
+          <w:b w:val="0"/>
+        </w:rPr>
+        <w:t>reintentar rapidamente con teclado,</w:t>
+      </w:r>
+    </w:p>
+    <w:p>
+      <w:pPr>
+        <w:pStyle w:val="ListBullet"/>
+        <w:spacing w:after="160" w:line="280" w:lineRule="auto"/>
+        <w:ind w:left="720" w:hanging="360"/>
+      </w:pPr>
+      <w:r>
+        <w:rPr>
+          <w:b w:val="0"/>
+        </w:rPr>
+        <w:t>volver al menú con teclado,</w:t>
+      </w:r>
+    </w:p>
+    <w:p>
+      <w:pPr>
+        <w:pStyle w:val="ListBullet"/>
+        <w:spacing w:after="160" w:line="280" w:lineRule="auto"/>
+        <w:ind w:left="720" w:hanging="360"/>
+      </w:pPr>
+      <w:r>
+        <w:rPr>
+          <w:b w:val="0"/>
+        </w:rPr>
+        <w:t>elegir forma inicial con feedback visible.</w:t>
       </w:r>
     </w:p>
     <w:p>

</xml_diff>